<commit_message>
v4 preserve zip order
</commit_message>
<xml_diff>
--- a/Declaration_Art45a_NFI2025-247_FredaJewels.docx
+++ b/Declaration_Art45a_NFI2025-247_FredaJewels.docx
@@ -6,110 +6,241 @@
       <w:pPr>
         <w:pStyle w:val="Ttulo1"/>
         <w:jc w:val="center"/>
+        <w:spacing w:before="0" w:after="120"/>
       </w:pPr>
       <w:r>
-        <w:t>Template Declaration – Article 45a of the VAT Implementing Regulation</w:t>
+        <w:t>Declaration – Article 45a of the VAT Implementing Regulation</w:t>
       </w:r>
     </w:p>
     <w:p>
+      <w:pPr>
+        <w:jc w:val="center"/>
+        <w:spacing w:before="0" w:after="360"/>
+      </w:pPr>
       <w:r>
-        <w:t>Statement by the purchaser for the purposes of proving the intra‑Community transport of goods.</w:t>
-      </w:r>
-    </w:p>
-    <w:p/>
-    <w:p>
-      <w:r>
-        <w:br/>
-        <w:t xml:space="preserve">I, Austin Pugliese, acting on behalf of the company FREDA JEWELS LLC DBA NOU, </w:t>
-      </w:r>
-      <w:r>
-        <w:br/>
-        <w:t xml:space="preserve">with VAT identification number N/A (non-EU entity, United States), hereby declare that the goods identified below were transported/dispatched </w:t>
-      </w:r>
-      <w:r>
-        <w:br/>
-        <w:t>from Portugal (Member State of origin) to United States of America – non-EU destination (Member State of destination).</w:t>
-      </w:r>
-      <w:r>
-        <w:br/>
-      </w:r>
-      <w:r>
-        <w:br/>
-        <w:t>Transaction details:</w:t>
-      </w:r>
-      <w:r>
-        <w:br/>
-        <w:t>• Invoice number: NFI2025/247</w:t>
-      </w:r>
-      <w:r>
-        <w:br/>
-        <w:t>• Invoice date: 29/12/2025</w:t>
-      </w:r>
-      <w:r>
-        <w:br/>
-        <w:t>• Description of goods: Freight services (FedEx) – transport of footwear samples and consolidated shipment of 43 cartons covered by invoice 2025/201</w:t>
-      </w:r>
-      <w:r>
-        <w:br/>
-        <w:t>• Quantity of goods: 4 freight line items: FedEx AWB 885266932651 (sample, 20/10/2025); AWB 885011475486 (6 sample pairs collected, 10/10/2025); freight cost for 43 cartons shipped under invoice 2025/201 on 31/10/2025; AWB 885650229853 (1 sample pair, 31/10/2025)</w:t>
-      </w:r>
-      <w:r>
-        <w:br/>
-        <w:t>• Date of arrival of goods: Various – October and November 2025 (approx. 3–5 business days after each FedEx waybill date)</w:t>
-      </w:r>
-      <w:r>
-        <w:br/>
-        <w:t>• Place of delivery: 747 N La Jolla Ave, Los Angeles, CA 90046, United States</w:t>
-      </w:r>
-      <w:r>
-        <w:br/>
-        <w:t>• Identification of the person receiving the goods: FREDA JEWELS LLC DBA NOU (consignee), 747 N La Jolla Ave, Los Angeles, CA 90046, United States</w:t>
-      </w:r>
-      <w:r>
-        <w:br/>
-      </w:r>
-      <w:r>
-        <w:br/>
-        <w:t>I further declare that the above‑mentioned goods were effectively received in the Member State of destination indicated above.</w:t>
-      </w:r>
-      <w:r>
-        <w:br/>
-      </w:r>
-      <w:r>
-        <w:br/>
-        <w:t>Place: Los Angeles, California, United States</w:t>
-      </w:r>
-      <w:r>
-        <w:br/>
-      </w:r>
-      <w:r>
-        <w:br/>
-        <w:t>Date: 22 / 05 / 2026</w:t>
-      </w:r>
-      <w:r>
-        <w:br/>
-      </w:r>
-      <w:r>
-        <w:br/>
-      </w:r>
-      <w:r>
-        <w:br/>
-        <w:t>Signature:</w:t>
-      </w:r>
-      <w:r>
-        <w:br/>
-        <w:t>________________________________________</w:t>
-      </w:r>
-      <w:r>
-        <w:br/>
+        <w:rPr>
+          <w:i/>
+          <w:color w:val="595959"/>
+        </w:rPr>
+        <w:t>Statement by the purchaser proving the intra-Community transport of goods.</w:t>
       </w:r>
     </w:p>
     <w:p>
+      <w:pPr>
+        <w:jc w:val="both"/>
+        <w:spacing w:before="0" w:after="200" w:line="288" w:lineRule="auto"/>
+      </w:pPr>
+      <w:r>
+        <w:t xml:space="preserve">I, Austin Pugliese, acting on behalf of the company FREDA JEWELS LLC DBA NOU, with VAT identification number N/A (non-EU entity, United States), hereby declare that the goods identified below were transported / dispatched from Portugal (Member State of origin) to the United States of America — non-EU destination (Member State of destination).</w:t>
+      </w:r>
+    </w:p>
+    <w:p>
+      <w:pPr>
+        <w:spacing w:before="240" w:after="120"/>
+        <w:pBdr>
+          <w:bottom w:val="single" w:sz="6" w:space="2" w:color="2E75B6"/>
+        </w:pBdr>
+      </w:pPr>
+      <w:r>
+        <w:rPr>
+          <w:b/>
+          <w:sz w:val="24"/>
+          <w:color w:val="2E75B6"/>
+        </w:rPr>
+        <w:t>Transaction Details</w:t>
+      </w:r>
+    </w:p>
+    <w:p>
+      <w:pPr>
+        <w:spacing w:before="0" w:after="120"/>
+        <w:ind w:left="120"/>
+      </w:pPr>
+      <w:r>
+        <w:rPr>
+          <w:b/>
+        </w:rPr>
+        <w:t xml:space="preserve">Invoice number: </w:t>
+      </w:r>
+      <w:r>
+        <w:t xml:space="preserve">NFI2025/247</w:t>
+      </w:r>
+    </w:p>
+    <w:p>
+      <w:pPr>
+        <w:spacing w:before="0" w:after="120"/>
+        <w:ind w:left="120"/>
+      </w:pPr>
+      <w:r>
+        <w:rPr>
+          <w:b/>
+        </w:rPr>
+        <w:t xml:space="preserve">Invoice date: </w:t>
+      </w:r>
+      <w:r>
+        <w:t xml:space="preserve">29 December 2025</w:t>
+      </w:r>
+    </w:p>
+    <w:p>
+      <w:pPr>
+        <w:spacing w:before="0" w:after="120"/>
+        <w:ind w:left="120"/>
+      </w:pPr>
+      <w:r>
+        <w:rPr>
+          <w:b/>
+        </w:rPr>
+        <w:t xml:space="preserve">Description of goods: </w:t>
+      </w:r>
+      <w:r>
+        <w:t xml:space="preserve">Freight services (FedEx) — transport of footwear samples and consolidated shipment of 43 cartons under invoice 2025/201.</w:t>
+      </w:r>
+    </w:p>
+    <w:p>
+      <w:pPr>
+        <w:spacing w:before="0" w:after="120"/>
+        <w:ind w:left="120"/>
+      </w:pPr>
+      <w:r>
+        <w:rPr>
+          <w:b/>
+        </w:rPr>
+        <w:t xml:space="preserve">Quantity of goods: </w:t>
+      </w:r>
+      <w:r>
+        <w:t xml:space="preserve">4 freight line items: AWB 885266932651 (1 sample pair, 20/10/2025); AWB 885011475486 (6 sample pairs, 10/10/2025); freight for 43 cartons shipped under invoice 2025/201 on 31/10/2025; AWB 885650229853 (1 sample pair, 31/10/2025).</w:t>
+      </w:r>
+    </w:p>
+    <w:p>
+      <w:pPr>
+        <w:spacing w:before="0" w:after="120"/>
+        <w:ind w:left="120"/>
+      </w:pPr>
+      <w:r>
+        <w:rPr>
+          <w:b/>
+        </w:rPr>
+        <w:t xml:space="preserve">Date of arrival of goods: </w:t>
+      </w:r>
+      <w:r>
+        <w:t xml:space="preserve">Various — October and November 2025 (approx. 3–5 business days after each FedEx waybill date).</w:t>
+      </w:r>
+    </w:p>
+    <w:p>
+      <w:pPr>
+        <w:spacing w:before="0" w:after="120"/>
+        <w:ind w:left="120"/>
+      </w:pPr>
+      <w:r>
+        <w:rPr>
+          <w:b/>
+        </w:rPr>
+        <w:t xml:space="preserve">Place of delivery: </w:t>
+      </w:r>
+      <w:r>
+        <w:t xml:space="preserve">747 N La Jolla Ave, Los Angeles, CA 90046, United States</w:t>
+      </w:r>
+    </w:p>
+    <w:p>
+      <w:pPr>
+        <w:spacing w:before="0" w:after="120"/>
+        <w:ind w:left="120"/>
+      </w:pPr>
+      <w:r>
+        <w:rPr>
+          <w:b/>
+        </w:rPr>
+        <w:t xml:space="preserve">Receiving party: </w:t>
+      </w:r>
+      <w:r>
+        <w:t xml:space="preserve">FREDA JEWELS LLC DBA NOU (consignee), 747 N La Jolla Ave, Los Angeles, CA 90046, United States</w:t>
+      </w:r>
+    </w:p>
+    <w:p>
+      <w:pPr>
+        <w:spacing w:before="240" w:after="120"/>
+        <w:pBdr>
+          <w:bottom w:val="single" w:sz="6" w:space="2" w:color="2E75B6"/>
+        </w:pBdr>
+      </w:pPr>
+      <w:r>
+        <w:rPr>
+          <w:b/>
+          <w:sz w:val="24"/>
+          <w:color w:val="2E75B6"/>
+        </w:rPr>
+        <w:t>Declaration</w:t>
+      </w:r>
+    </w:p>
+    <w:p>
+      <w:pPr>
+        <w:jc w:val="both"/>
+        <w:spacing w:before="0" w:after="200" w:line="288" w:lineRule="auto"/>
+      </w:pPr>
+      <w:r>
+        <w:t xml:space="preserve">I further declare that the above-mentioned goods were effectively received in the Member State of destination indicated above.</w:t>
+      </w:r>
+    </w:p>
+    <w:p>
+      <w:pPr>
+        <w:spacing w:before="360" w:after="120"/>
+      </w:pPr>
+      <w:r>
+        <w:rPr>
+          <w:b/>
+        </w:rPr>
+        <w:t xml:space="preserve">Place: </w:t>
+      </w:r>
+      <w:r>
+        <w:t>Los Angeles, California, United States</w:t>
+      </w:r>
+    </w:p>
+    <w:p>
+      <w:pPr>
+        <w:spacing w:before="0" w:after="480"/>
+      </w:pPr>
+      <w:r>
+        <w:rPr>
+          <w:b/>
+        </w:rPr>
+        <w:t xml:space="preserve">Date: </w:t>
+      </w:r>
+      <w:r>
+        <w:t>22 / 05 / 2026</w:t>
+      </w:r>
+    </w:p>
+    <w:p>
+      <w:pPr>
+        <w:spacing w:before="0" w:after="0"/>
+      </w:pPr>
+      <w:r>
+        <w:rPr>
+          <w:b/>
+        </w:rPr>
+        <w:t>Signature:</w:t>
+      </w:r>
+    </w:p>
+    <w:p>
+      <w:pPr>
+        <w:spacing w:before="240" w:after="0"/>
+      </w:pPr>
+      <w:r>
+        <w:t>________________________________________</w:t>
+      </w:r>
+    </w:p>
+    <w:p>
+      <w:pPr>
+        <w:spacing w:before="600" w:after="0"/>
+        <w:pBdr>
+          <w:top w:val="single" w:sz="4" w:space="6" w:color="BFBFBF"/>
+        </w:pBdr>
+      </w:pPr>
       <w:r>
         <w:rPr>
           <w:i/>
+          <w:sz w:val="18"/>
+          <w:color w:val="595959"/>
         </w:rPr>
-        <w:t>Note: This template is intended to support compliance with Article 45a of Council Implementing Regulation (EU) No 282/2011.</w:t>
+        <w:t xml:space="preserve">Note: This template is intended to support compliance with Article 45a of Council Implementing Regulation (EU) No 282/2011.</w:t>
       </w:r>
     </w:p>
     <w:sectPr>

</xml_diff>